<commit_message>
REV A: shrink PCB to 53.4x30.5mm, update all docs, add Gerber/BOM
- PCB shrunk from 63.5mm to 53.4mm length (16% smaller)
- README rewritten for REV A: correct BOM (680Ω LEDs, LED2=green),
  net names table, power budget, boost specs, design verification
- Design doc regenerated with REV A designation and board dimensions
- EasyEDA project updated with compact layout and routing
- Added Gerber and BOM exports for JLCPCB

Co-Authored-By: Claude Opus 4.6 (1M context) <noreply@anthropic.com>
</commit_message>
<xml_diff>
--- a/Docs/FLARM_USB_Updater_Design_Document.docx
+++ b/Docs/FLARM_USB_Updater_Design_Document.docx
@@ -27,7 +27,24 @@
     </w:p>
     <w:p>
       <w:pPr>
-        <w:spacing w:after="400"/>
+        <w:spacing w:after="100"/>
+        <w:jc w:val="center"/>
+      </w:pPr>
+      <w:r>
+        <w:rPr>
+          <w:rFonts w:ascii="Arial" w:cs="Arial" w:eastAsia="Arial" w:hAnsi="Arial"/>
+          <w:b/>
+          <w:bCs/>
+          <w:color w:val="1B3A5C"/>
+          <w:sz w:val="24"/>
+          <w:szCs w:val="24"/>
+        </w:rPr>
+        <w:t xml:space="preserve">REV A</w:t>
+      </w:r>
+    </w:p>
+    <w:p>
+      <w:pPr>
+        <w:spacing w:after="100"/>
         <w:jc w:val="center"/>
       </w:pPr>
       <w:r>
@@ -36,7 +53,21 @@
           <w:sz w:val="20"/>
           <w:szCs w:val="20"/>
         </w:rPr>
-        <w:t xml:space="preserve">Rev 1.0 — March 2026</w:t>
+        <w:t xml:space="preserve">PCB: 53.4 × 30.5 mm (2102 × 1200 mil), 2-layer FR4</w:t>
+      </w:r>
+    </w:p>
+    <w:p>
+      <w:pPr>
+        <w:spacing w:after="400"/>
+        <w:jc w:val="center"/>
+      </w:pPr>
+      <w:r>
+        <w:rPr>
+          <w:color w:val="666666"/>
+          <w:sz w:val="20"/>
+          <w:szCs w:val="20"/>
+        </w:rPr>
+        <w:t xml:space="preserve">March 2026</w:t>
       </w:r>
     </w:p>
     <w:p>
@@ -179,7 +210,7 @@
           <w:sz w:val="20"/>
           <w:szCs w:val="20"/>
         </w:rPr>
-        <w:t xml:space="preserve">3 status LEDs: power (green), TX (yellow), RX (yellow)</w:t>
+        <w:t xml:space="preserve">3 status LEDs: power (green), TX (green), RX (yellow)</w:t>
       </w:r>
     </w:p>
     <w:p>
@@ -478,7 +509,7 @@
           <w:sz w:val="20"/>
           <w:szCs w:val="20"/>
         </w:rPr>
-        <w:t xml:space="preserve">LED2 (yellow, KT-0805Y): TX activity. R8 (680Ω) to TXLED (CBUS0). I = (5-2.1)/680 = 4.3mA when active.</w:t>
+        <w:t xml:space="preserve">LED2 (green, KT-0805G): TX activity. R8 (680Ω) to TXLED (CBUS0). I = (5-2.8)/680 = 3.2mA when active.</w:t>
       </w:r>
     </w:p>
     <w:p>
@@ -4459,7 +4490,7 @@
                 <w:sz w:val="18"/>
                 <w:szCs w:val="18"/>
               </w:rPr>
-              <w:t xml:space="preserve">KT-0805Y</w:t>
+              <w:t xml:space="preserve">KT-0805G</w:t>
             </w:r>
           </w:p>
         </w:tc>
@@ -4485,7 +4516,7 @@
                 <w:sz w:val="18"/>
                 <w:szCs w:val="18"/>
               </w:rPr>
-              <w:t xml:space="preserve">TX LED (yellow)</w:t>
+              <w:t xml:space="preserve">TX LED (green)</w:t>
             </w:r>
           </w:p>
         </w:tc>
@@ -4537,7 +4568,7 @@
                 <w:sz w:val="18"/>
                 <w:szCs w:val="18"/>
               </w:rPr>
-              <w:t xml:space="preserve">C2296</w:t>
+              <w:t xml:space="preserve">C2297</w:t>
             </w:r>
           </w:p>
         </w:tc>
@@ -7582,6 +7613,18 @@
       </w:pPr>
       <w:r>
         <w:t xml:space="preserve">6. PCB Design</w:t>
+      </w:r>
+    </w:p>
+    <w:p>
+      <w:pPr>
+        <w:spacing w:after="100"/>
+      </w:pPr>
+      <w:r>
+        <w:rPr>
+          <w:b/>
+          <w:bCs/>
+        </w:rPr>
+        <w:t xml:space="preserve">Board: 53.4 × 30.5 mm (2102 × 1200 mil), 2-layer FR4, 1oz copper.</w:t>
       </w:r>
     </w:p>
     <w:p>
@@ -7598,7 +7641,7 @@
           <w:sz w:val="20"/>
           <w:szCs w:val="20"/>
         </w:rPr>
-        <w:t xml:space="preserve">2-layer board with GND copper pour on both layers</w:t>
+        <w:t xml:space="preserve">GND copper pour on both layers (164 poured regions)</w:t>
       </w:r>
     </w:p>
     <w:p>
@@ -7615,7 +7658,7 @@
           <w:sz w:val="20"/>
           <w:szCs w:val="20"/>
         </w:rPr>
-        <w:t xml:space="preserve">Via stitching between top and bottom ground planes</w:t>
+        <w:t xml:space="preserve">51 vias (49 GND, 2 VUSB) for ground plane stitching</w:t>
       </w:r>
     </w:p>
     <w:p>
@@ -7632,7 +7675,7 @@
           <w:sz w:val="20"/>
           <w:szCs w:val="20"/>
         </w:rPr>
-        <w:t xml:space="preserve">Power traces (VUSB, VBOOST, V12_OUT, GND): 20mil minimum</w:t>
+        <w:t xml:space="preserve">Power traces (VUSB, VBOOST, SW, V3V3): 20mil</w:t>
       </w:r>
     </w:p>
     <w:p>
@@ -7649,7 +7692,7 @@
           <w:sz w:val="20"/>
           <w:szCs w:val="20"/>
         </w:rPr>
-        <w:t xml:space="preserve">Signal traces (UART, RS232, USB, LED): 10mil</w:t>
+        <w:t xml:space="preserve">V12_OUT traces: 15mil</w:t>
       </w:r>
     </w:p>
     <w:p>
@@ -7666,7 +7709,7 @@
           <w:sz w:val="20"/>
           <w:szCs w:val="20"/>
         </w:rPr>
-        <w:t xml:space="preserve">USB differential pair (UD+/UD-): matched length</w:t>
+        <w:t xml:space="preserve">Signal traces (UART, RS232, USB, LED): 10mil</w:t>
       </w:r>
     </w:p>
     <w:p>
@@ -7683,7 +7726,7 @@
           <w:sz w:val="20"/>
           <w:szCs w:val="20"/>
         </w:rPr>
-        <w:t xml:space="preserve">M2.5 mounting holes at opposite corners (GND net)</w:t>
+        <w:t xml:space="preserve">USB differential pair (UD+/UD-): length matched at 24.3mm</w:t>
       </w:r>
     </w:p>
     <w:p>
@@ -7700,7 +7743,7 @@
           <w:sz w:val="20"/>
           <w:szCs w:val="20"/>
         </w:rPr>
-        <w:t xml:space="preserve">Test points: VUSB, VBOOST, V12_OUT, V3V3, GND</w:t>
+        <w:t xml:space="preserve">312 trace segments across 29 routed nets</w:t>
       </w:r>
     </w:p>
     <w:p>
@@ -7789,7 +7832,7 @@
         <w:spacing w:after="200"/>
       </w:pPr>
       <w:r>
-        <w:t xml:space="preserve">Limits current between AMS1117-3.3 output and FLARM's internal 3.3V regulator on pin 3. During firmware updates, FLARM drives pin 3 at ~3.3V; R6 prevents significant backfeed current between the two regulators.</w:t>
+        <w:t xml:space="preserve">FLARM outputs up to 200mA at 3.3V on pin 3 (per FLARM manual). Without R6, two LDO outputs would fight, causing uncontrolled current flow. R6 limits mismatch current to ~10mA max. AMS1117 handles backfeed safely with 22µF caps (no protection diode needed). Can be replaced with 0Ω if display voltage drop is an issue.</w:t>
       </w:r>
     </w:p>
     <w:p>
@@ -7813,7 +7856,193 @@
         <w:pStyle w:val="Heading1"/>
       </w:pPr>
       <w:r>
-        <w:t xml:space="preserve">8. Remaining Items</w:t>
+        <w:t xml:space="preserve">8. Design Verification (REV A)</w:t>
+      </w:r>
+    </w:p>
+    <w:p>
+      <w:pPr>
+        <w:spacing w:after="100"/>
+      </w:pPr>
+      <w:r>
+        <w:t xml:space="preserve">Full electrical review completed 2026-03-13:</w:t>
+      </w:r>
+    </w:p>
+    <w:p>
+      <w:pPr>
+        <w:pStyle w:val="ListParagraph"/>
+        <w:numPr>
+          <w:ilvl w:val="0"/>
+          <w:numId w:val="2"/>
+        </w:numPr>
+        <w:spacing w:after="60"/>
+      </w:pPr>
+      <w:r>
+        <w:rPr>
+          <w:sz w:val="20"/>
+          <w:szCs w:val="20"/>
+        </w:rPr>
+        <w:t xml:space="preserve">FT232RL: all 28 pins verified (TEST→GND, CTS/DSR/DCD/RI→GND, OSCI/OSCO NC)</w:t>
+      </w:r>
+    </w:p>
+    <w:p>
+      <w:pPr>
+        <w:pStyle w:val="ListParagraph"/>
+        <w:numPr>
+          <w:ilvl w:val="0"/>
+          <w:numId w:val="2"/>
+        </w:numPr>
+        <w:spacing w:after="60"/>
+      </w:pPr>
+      <w:r>
+        <w:rPr>
+          <w:sz w:val="20"/>
+          <w:szCs w:val="20"/>
+        </w:rPr>
+        <w:t xml:space="preserve">MAX3232: charge pump caps correct, ch1 UART↔RS232, T2IN (pin 10) tied to GND</w:t>
+      </w:r>
+    </w:p>
+    <w:p>
+      <w:pPr>
+        <w:pStyle w:val="ListParagraph"/>
+        <w:numPr>
+          <w:ilvl w:val="0"/>
+          <w:numId w:val="2"/>
+        </w:numPr>
+        <w:spacing w:after="60"/>
+      </w:pPr>
+      <w:r>
+        <w:rPr>
+          <w:sz w:val="20"/>
+          <w:szCs w:val="20"/>
+        </w:rPr>
+        <w:t xml:space="preserve">MT3608: boost topology correct, Vout=12.36V, D1 polarity correct</w:t>
+      </w:r>
+    </w:p>
+    <w:p>
+      <w:pPr>
+        <w:pStyle w:val="ListParagraph"/>
+        <w:numPr>
+          <w:ilvl w:val="0"/>
+          <w:numId w:val="2"/>
+        </w:numPr>
+        <w:spacing w:after="60"/>
+      </w:pPr>
+      <w:r>
+        <w:rPr>
+          <w:sz w:val="20"/>
+          <w:szCs w:val="20"/>
+        </w:rPr>
+        <w:t xml:space="preserve">USB-C: CC pulldowns 5.1kΩ, D+/D- through USBLC6, both orientations</w:t>
+      </w:r>
+    </w:p>
+    <w:p>
+      <w:pPr>
+        <w:pStyle w:val="ListParagraph"/>
+        <w:numPr>
+          <w:ilvl w:val="0"/>
+          <w:numId w:val="2"/>
+        </w:numPr>
+        <w:spacing w:after="60"/>
+      </w:pPr>
+      <w:r>
+        <w:rPr>
+          <w:sz w:val="20"/>
+          <w:szCs w:val="20"/>
+        </w:rPr>
+        <w:t xml:space="preserve">AMS1117: V3V3 → R6 (10Ω) → RJ45 pin 3, adequate headroom (1.7V)</w:t>
+      </w:r>
+    </w:p>
+    <w:p>
+      <w:pPr>
+        <w:pStyle w:val="ListParagraph"/>
+        <w:numPr>
+          <w:ilvl w:val="0"/>
+          <w:numId w:val="2"/>
+        </w:numPr>
+        <w:spacing w:after="60"/>
+      </w:pPr>
+      <w:r>
+        <w:rPr>
+          <w:sz w:val="20"/>
+          <w:szCs w:val="20"/>
+        </w:rPr>
+        <w:t xml:space="preserve">LED circuits: active-low CBUS, correct polarity, 3.2–4.3mA</w:t>
+      </w:r>
+    </w:p>
+    <w:p>
+      <w:pPr>
+        <w:pStyle w:val="ListParagraph"/>
+        <w:numPr>
+          <w:ilvl w:val="0"/>
+          <w:numId w:val="2"/>
+        </w:numPr>
+        <w:spacing w:after="60"/>
+      </w:pPr>
+      <w:r>
+        <w:rPr>
+          <w:sz w:val="20"/>
+          <w:szCs w:val="20"/>
+        </w:rPr>
+        <w:t xml:space="preserve">RJ45 pinout matches FLARM IGC specification</w:t>
+      </w:r>
+    </w:p>
+    <w:p>
+      <w:pPr>
+        <w:pStyle w:val="ListParagraph"/>
+        <w:numPr>
+          <w:ilvl w:val="0"/>
+          <w:numId w:val="2"/>
+        </w:numPr>
+        <w:spacing w:after="60"/>
+      </w:pPr>
+      <w:r>
+        <w:rPr>
+          <w:sz w:val="20"/>
+          <w:szCs w:val="20"/>
+        </w:rPr>
+        <w:t xml:space="preserve">USB D+/D- length matched (24.3mm each)</w:t>
+      </w:r>
+    </w:p>
+    <w:p>
+      <w:pPr>
+        <w:pStyle w:val="ListParagraph"/>
+        <w:numPr>
+          <w:ilvl w:val="0"/>
+          <w:numId w:val="2"/>
+        </w:numPr>
+        <w:spacing w:after="60"/>
+      </w:pPr>
+      <w:r>
+        <w:rPr>
+          <w:sz w:val="20"/>
+          <w:szCs w:val="20"/>
+        </w:rPr>
+        <w:t xml:space="preserve">Power budget: ~280mA within USB 2.0 500mA limit</w:t>
+      </w:r>
+    </w:p>
+    <w:p>
+      <w:pPr>
+        <w:pStyle w:val="ListParagraph"/>
+        <w:numPr>
+          <w:ilvl w:val="0"/>
+          <w:numId w:val="2"/>
+        </w:numPr>
+        <w:spacing w:after="60"/>
+      </w:pPr>
+      <w:r>
+        <w:rPr>
+          <w:sz w:val="20"/>
+          <w:szCs w:val="20"/>
+        </w:rPr>
+        <w:t xml:space="preserve">All capacitor voltage ratings ≥1.8×, all resistor power ratings &lt;40%</w:t>
+      </w:r>
+    </w:p>
+    <w:p>
+      <w:pPr>
+        <w:pStyle w:val="Heading1"/>
+      </w:pPr>
+      <w:r>
+        <w:t xml:space="preserve">9. Remaining Items</w:t>
       </w:r>
     </w:p>
     <w:p>
@@ -7830,7 +8059,7 @@
           <w:sz w:val="20"/>
           <w:szCs w:val="20"/>
         </w:rPr>
-        <w:t xml:space="preserve">Tie MAX3232 pin 10 (T2IN) to GND in schematic</w:t>
+        <w:t xml:space="preserve">Run ERC and DRC in EasyEDA Pro</w:t>
       </w:r>
     </w:p>
     <w:p>
@@ -7847,7 +8076,7 @@
           <w:sz w:val="20"/>
           <w:szCs w:val="20"/>
         </w:rPr>
-        <w:t xml:space="preserve">Verify R7/R8/R9 are updated to 680Ω (0402WGF6800TCE)</w:t>
+        <w:t xml:space="preserve">Verify SMD RJ45 (RJ-064-1) C-number for JLCPCB</w:t>
       </w:r>
     </w:p>
     <w:p>
@@ -7864,7 +8093,7 @@
           <w:sz w:val="20"/>
           <w:szCs w:val="20"/>
         </w:rPr>
-        <w:t xml:space="preserve">Run ERC and DRC in EasyEDA Pro</w:t>
+        <w:t xml:space="preserve">Export Gerber, BOM, CPL for JLCPCB order</w:t>
       </w:r>
     </w:p>
     <w:p>
@@ -7881,24 +8110,7 @@
           <w:sz w:val="20"/>
           <w:szCs w:val="20"/>
         </w:rPr>
-        <w:t xml:space="preserve">Verify SMD RJ45 (RJ-064-1) footprint and C-number</w:t>
-      </w:r>
-    </w:p>
-    <w:p>
-      <w:pPr>
-        <w:pStyle w:val="ListParagraph"/>
-        <w:numPr>
-          <w:ilvl w:val="0"/>
-          <w:numId w:val="4"/>
-        </w:numPr>
-        <w:spacing w:after="80"/>
-      </w:pPr>
-      <w:r>
-        <w:rPr>
-          <w:sz w:val="20"/>
-          <w:szCs w:val="20"/>
-        </w:rPr>
-        <w:t xml:space="preserve">Export Gerber, BOM, CPL for JLCPCB order</w:t>
+        <w:t xml:space="preserve">Test AMS1117 output stability with MLCC caps after build</w:t>
       </w:r>
     </w:p>
     <w:p>

</xml_diff>

<commit_message>
REV B 2026-05-17: audited boost + MAX3232 fix, fresh fab exports
Schematic + PCB + exported-netlist all cross-verified: boost topology
correct (VUSB->L1->SW; D1 anode@SW cathode@V12_OUT; R1 100k/R2 5.1k ->
12.36V), MAX3232 on 3.3V rail, USB diff pairs matched, FB trace tidy.
Adds 2026-05-17 Gerber/BOM/netlist/P&P and regenerated design doc.
Fix create_design_doc.js: write relative to __dirname (was a stale
hardcoded absolute path that broke regeneration).

Co-Authored-By: Claude Opus 4.7 <noreply@anthropic.com>
</commit_message>
<xml_diff>
--- a/Docs/FLARM_USB_Updater_Design_Document.docx
+++ b/Docs/FLARM_USB_Updater_Design_Document.docx
@@ -459,7 +459,7 @@
         <w:spacing w:after="200"/>
       </w:pPr>
       <w:r>
-        <w:t xml:space="preserve">MAX3232 (U2) converts TTL UART to RS232 levels. C5 is VCC bypass (pin 16). C6/C7 are the charge pump flying caps (C1±/C2±). C8/C9 are V+/V- storage caps. All five are 100nF, which is the MAX3232 datasheet value for 3V–5.5V operation. Channel 1 carries FLARM communication. Channel 2 is unused; T2IN (pin 10) is tied to GND to prevent floating-input oscillation; the other channel-2 pins are left floating (allowed by datasheet).</w:t>
+        <w:t xml:space="preserve">MAX3232 (U2) converts TTL UART to RS232 levels. U2 is powered from the 3.3V rail (V3V3, AMS1117 output on the regulator side of R6), so the FT232RL↔MAX3232 interface is level-matched at 3.3V in both directions with in-spec margin (MAX3232 driver V_IH = 2.0V at VCC = 3.3V; FT232RL TXD high = 2.2V min at VCCIO = 3.3V). C5 is VCC bypass (pin 16). C6/C7 are the charge pump flying caps (C1±/C2±). C8/C9 are V+/V- storage caps. All five are 100nF, which is the MAX3232 datasheet value for 3V–5.5V operation. Channel 1 carries FLARM communication. Channel 2 is unused; T2IN (pin 10) is tied to GND to prevent floating-input oscillation; the other channel-2 pins are left floating (allowed by datasheet).</w:t>
       </w:r>
     </w:p>
     <w:p>
@@ -7888,7 +7888,7 @@
         <w:spacing w:after="100"/>
       </w:pPr>
       <w:r>
-        <w:t xml:space="preserve">REV A was ordered, received, and bench-tested. RS232, USB, 3.3V rail, and LEDs all worked. The 12V boost rail produced 0V due to incorrect L1/D1 placement. REV B fixes this; a single other known issue (VCCIO on 5V) is deferred.</w:t>
+        <w:t xml:space="preserve">REV A was ordered, received, and bench-tested. RS232, USB, 3.3V rail, and LEDs all worked. The 12V boost rail produced 0V due to incorrect L1/D1 placement. REV B fixes this and refines the MAX3232 supply; there are no deferred electrical issues.</w:t>
       </w:r>
     </w:p>
     <w:p>
@@ -8003,38 +8003,6 @@
     </w:p>
     <w:p>
       <w:pPr>
-        <w:pStyle w:val="Heading3"/>
-      </w:pPr>
-      <w:r>
-        <w:t xml:space="preserve">Deferred (not fixed in REV B)</w:t>
-      </w:r>
-    </w:p>
-    <w:p>
-      <w:pPr>
-        <w:spacing w:after="200"/>
-      </w:pPr>
-      <w:r>
-        <w:t xml:space="preserve">FT232RL VCCIO (pin 4) is still tied to VUSB (5V). UART signals on the J3 header are 5V TTL. This is fine for MAX3232 (3–5.5V tolerant) and for 5V-tolerant external MCUs, but not safe for 3.3V-only targets via J3. Fix planned: tie VCCIO to FT_3V3 (pin 17) in a future revision. Low priority — main use case is the RS232 path to FLARM, unaffected by VCCIO voltage.</w:t>
-      </w:r>
-    </w:p>
-    <w:p>
-      <w:pPr>
-        <w:pStyle w:val="Heading1"/>
-      </w:pPr>
-      <w:r>
-        <w:t xml:space="preserve">9. Design Verification (REV B)</w:t>
-      </w:r>
-    </w:p>
-    <w:p>
-      <w:pPr>
-        <w:spacing w:after="100"/>
-      </w:pPr>
-      <w:r>
-        <w:t xml:space="preserve">Netlist and BOM review completed 2026-04-20 against REV B EasyEDA project export:</w:t>
-      </w:r>
-    </w:p>
-    <w:p>
-      <w:pPr>
         <w:pStyle w:val="ListParagraph"/>
         <w:numPr>
           <w:ilvl w:val="0"/>
@@ -8047,7 +8015,39 @@
           <w:sz w:val="20"/>
           <w:szCs w:val="20"/>
         </w:rPr>
-        <w:t xml:space="preserve">FT232RL: all 28 pins verified (TEST→GND, CTS/DSR/DCD/RI→GND, OSCI/OSCO NC, VCCIO on VUSB=5V)</w:t>
+        <w:t xml:space="preserve">MAX3232 supply — VCC (U2 pin 16) and bypass cap C5 moved from VUSB (5V) to the 3.3V rail (V3V3, AMS1117 output on the regulator side of R6). Closes a worst-case out-of-spec logic-high margin: a 5V-powered MAX3232 needs 2.4V V_IH but the FT232RL TXD only guarantees 2.2V at VCCIO=3.3V. At VCC=3.3V the MAX3232 V_IH is 2.0V — in spec. Both ICs now share the 3.3V rail.</w:t>
+      </w:r>
+    </w:p>
+    <w:p>
+      <w:pPr>
+        <w:pStyle w:val="Heading3"/>
+      </w:pPr>
+      <w:r>
+        <w:t xml:space="preserve">FT232RL VCCIO / J3 logic level</w:t>
+      </w:r>
+    </w:p>
+    <w:p>
+      <w:pPr>
+        <w:spacing w:after="200"/>
+      </w:pPr>
+      <w:r>
+        <w:t xml:space="preserve">FT232RL VCCIO (pin 4) is tied to 3V3OUT (pin 17, the FT232RL's internal 3.3V regulator), so the J3 breakout header is 3.3V TTL — safe to connect directly to any 3.3V MCU (nRF, RP2040, ESP32, STM32). FT232RL VCC (pin 20) is on USB 5V, which powers the USB interface only and does not set the I/O logic level. There are no deferred electrical issues.</w:t>
+      </w:r>
+    </w:p>
+    <w:p>
+      <w:pPr>
+        <w:pStyle w:val="Heading1"/>
+      </w:pPr>
+      <w:r>
+        <w:t xml:space="preserve">9. Design Verification (REV B)</w:t>
+      </w:r>
+    </w:p>
+    <w:p>
+      <w:pPr>
+        <w:spacing w:after="100"/>
+      </w:pPr>
+      <w:r>
+        <w:t xml:space="preserve">Netlist and BOM review, re-verified 2026-05-15 against the REV B EasyEDA project export (programmatic netlist parse cross-checked against component datasheets):</w:t>
       </w:r>
     </w:p>
     <w:p>
@@ -8064,7 +8064,7 @@
           <w:sz w:val="20"/>
           <w:szCs w:val="20"/>
         </w:rPr>
-        <w:t xml:space="preserve">MAX3232: C5 is VCC bypass; C6/C7 charge pumps; C8/C9 V± storage. Ch1 UART↔RS232, T2IN (pin 10) tied to GND</w:t>
+        <w:t xml:space="preserve">FT232RL: all 28 pins verified (TEST→GND, CTS/DSR/DCD/RI→GND, OSCI/OSCO NC, VCC on VUSB=5V, VCCIO on FT_3V3=3.3V)</w:t>
       </w:r>
     </w:p>
     <w:p>
@@ -8081,7 +8081,7 @@
           <w:sz w:val="20"/>
           <w:szCs w:val="20"/>
         </w:rPr>
-        <w:t xml:space="preserve">MT3608: VUSB→L1→SW→D1→V12_OUT. Feedback 100k/5.1k gives 12.35V. Boost topology now correct</w:t>
+        <w:t xml:space="preserve">MAX3232: VCC on V3V3 (3.3V rail); C5 is VCC bypass; C6/C7 charge pumps; C8/C9 V± storage. Ch1 UART↔RS232, T2IN (pin 10) tied to GND</w:t>
       </w:r>
     </w:p>
     <w:p>
@@ -8098,7 +8098,7 @@
           <w:sz w:val="20"/>
           <w:szCs w:val="20"/>
         </w:rPr>
-        <w:t xml:space="preserve">USB-C: CC1/CC2 pulldowns 5.1kΩ, D+/D- through USBLC6 (diff-pair rule active), both orientations</w:t>
+        <w:t xml:space="preserve">MT3608: VUSB→L1→SW→D1→V12_OUT. Feedback 100k/5.1k gives 12.35V. Boost topology now correct</w:t>
       </w:r>
     </w:p>
     <w:p>
@@ -8115,7 +8115,7 @@
           <w:sz w:val="20"/>
           <w:szCs w:val="20"/>
         </w:rPr>
-        <w:t xml:space="preserve">AMS1117: V3V3 → R6 (10Ω) → RJ45 pin 3, adequate headroom (1.7V)</w:t>
+        <w:t xml:space="preserve">USB-C: CC1/CC2 pulldowns 5.1kΩ, D+/D- through USBLC6 (diff-pair rule active), both orientations</w:t>
       </w:r>
     </w:p>
     <w:p>
@@ -8132,7 +8132,7 @@
           <w:sz w:val="20"/>
           <w:szCs w:val="20"/>
         </w:rPr>
-        <w:t xml:space="preserve">LED circuits: active-low CBUS, correct polarity, 3.2–4.3mA (LED2 now correctly yellow)</w:t>
+        <w:t xml:space="preserve">AMS1117: V3V3 → R6 (10Ω) → RJ45 pin 3, adequate headroom (1.7V)</w:t>
       </w:r>
     </w:p>
     <w:p>
@@ -8149,7 +8149,7 @@
           <w:sz w:val="20"/>
           <w:szCs w:val="20"/>
         </w:rPr>
-        <w:t xml:space="preserve">RJ45 pinout matches FLARM IGC specification (SMD connector uses reversed pad numbering, compensated in routing)</w:t>
+        <w:t xml:space="preserve">LED circuits: active-low CBUS, correct polarity, 3.2–4.3mA (LED2 now correctly yellow)</w:t>
       </w:r>
     </w:p>
     <w:p>
@@ -8166,7 +8166,7 @@
           <w:sz w:val="20"/>
           <w:szCs w:val="20"/>
         </w:rPr>
-        <w:t xml:space="preserve">USB D+/D- configured as differential pair (DP1, DP2), 6mil/6mil</w:t>
+        <w:t xml:space="preserve">RJ45 pinout matches FLARM IGC specification (SMD connector uses reversed pad numbering, compensated in routing)</w:t>
       </w:r>
     </w:p>
     <w:p>
@@ -8183,7 +8183,7 @@
           <w:sz w:val="20"/>
           <w:szCs w:val="20"/>
         </w:rPr>
-        <w:t xml:space="preserve">GND pour both layers, 54 stitching vias</w:t>
+        <w:t xml:space="preserve">USB D+/D- configured as differential pair (DP1, DP2), 6mil/6mil</w:t>
       </w:r>
     </w:p>
     <w:p>
@@ -8200,7 +8200,7 @@
           <w:sz w:val="20"/>
           <w:szCs w:val="20"/>
         </w:rPr>
-        <w:t xml:space="preserve">Power budget: ~280mA within USB 2.0 500mA limit</w:t>
+        <w:t xml:space="preserve">GND pour both layers, 54 stitching vias</w:t>
       </w:r>
     </w:p>
     <w:p>
@@ -8217,6 +8217,23 @@
           <w:sz w:val="20"/>
           <w:szCs w:val="20"/>
         </w:rPr>
+        <w:t xml:space="preserve">Power budget: ~280mA within USB 2.0 500mA limit</w:t>
+      </w:r>
+    </w:p>
+    <w:p>
+      <w:pPr>
+        <w:pStyle w:val="ListParagraph"/>
+        <w:numPr>
+          <w:ilvl w:val="0"/>
+          <w:numId w:val="2"/>
+        </w:numPr>
+        <w:spacing w:after="60"/>
+      </w:pPr>
+      <w:r>
+        <w:rPr>
+          <w:sz w:val="20"/>
+          <w:szCs w:val="20"/>
+        </w:rPr>
         <w:t xml:space="preserve">All capacitor voltage ratings ≥1.8×, all resistor power ratings &lt;40%</w:t>
       </w:r>
     </w:p>
@@ -8294,23 +8311,6 @@
           <w:szCs w:val="20"/>
         </w:rPr>
         <w:t xml:space="preserve">Program FT232RL EEPROM via FT_PROG (device description, unique serial) — optional</w:t>
-      </w:r>
-    </w:p>
-    <w:p>
-      <w:pPr>
-        <w:pStyle w:val="ListParagraph"/>
-        <w:numPr>
-          <w:ilvl w:val="0"/>
-          <w:numId w:val="4"/>
-        </w:numPr>
-        <w:spacing w:after="80"/>
-      </w:pPr>
-      <w:r>
-        <w:rPr>
-          <w:sz w:val="20"/>
-          <w:szCs w:val="20"/>
-        </w:rPr>
-        <w:t xml:space="preserve">Future REV: move VCCIO to 3.3V (J3 header at 3.3V TTL for 3.3V-only targets)</w:t>
       </w:r>
     </w:p>
     <w:sectPr>

</xml_diff>